<commit_message>
Update resume documents and preview
</commit_message>
<xml_diff>
--- a/public/assets/resume/Eric-Gabriel-Cheng-Li-Resume.docx
+++ b/public/assets/resume/Eric-Gabriel-Cheng-Li-Resume.docx
@@ -347,13 +347,6 @@
       </w:pPr>
       <w:r>
         <w:rPr>
-          <w:b/>
-          <w:sz w:val="18"/>
-        </w:rPr>
-        <w:t xml:space="preserve">3D </w:t>
-      </w:r>
-      <w:r>
-        <w:rPr>
           <w:rFonts w:eastAsia="SimSun" w:hint="eastAsia"/>
           <w:b/>
           <w:sz w:val="18"/>
@@ -382,36 +375,11 @@
         </w:rPr>
         <w:t>, GAEA</w:t>
       </w:r>
-    </w:p>
-    <w:p>
-      <w:pPr>
-        <w:spacing w:after="20"/>
-        <w:rPr>
-          <w:rFonts w:eastAsia="SimSun"/>
-          <w:lang w:eastAsia="zh-CN"/>
-        </w:rPr>
-      </w:pPr>
-      <w:r>
-        <w:rPr>
-          <w:b/>
-          <w:sz w:val="18"/>
-        </w:rPr>
-        <w:t>Game Tools</w:t>
-      </w:r>
-      <w:r>
-        <w:rPr>
-          <w:rFonts w:eastAsia="SimSun" w:hint="eastAsia"/>
-          <w:b/>
-          <w:sz w:val="18"/>
-          <w:lang w:eastAsia="zh-CN"/>
-        </w:rPr>
-        <w:t>:</w:t>
-      </w:r>
       <w:r>
         <w:rPr>
           <w:sz w:val="18"/>
         </w:rPr>
-        <w:t xml:space="preserve"> </w:t>
+        <w:t xml:space="preserve">, </w:t>
       </w:r>
       <w:r>
         <w:rPr>
@@ -425,7 +393,7 @@
           <w:sz w:val="18"/>
           <w:lang w:eastAsia="zh-CN"/>
         </w:rPr>
-        <w:t>t.</w:t>
+        <w:t>t</w:t>
       </w:r>
     </w:p>
     <w:p>
@@ -523,12 +491,13 @@
           <w:p>
             <w:pPr>
               <w:keepNext/>
-              <w:spacing w:after="20"/>
+              <w:spacing w:line="300" w:lineRule="exact"/>
               <w:rPr>
                 <w:rFonts w:eastAsia="SimSun"/>
                 <w:b/>
                 <w:i/>
-                <w:sz w:val="19"/>
+                <w:sz w:val="18"/>
+                <w:szCs w:val="18"/>
                 <w:lang w:eastAsia="zh-CN"/>
               </w:rPr>
             </w:pPr>
@@ -536,6 +505,8 @@
               <w:rPr>
                 <w:b/>
                 <w:color w:val="191919"/>
+                <w:sz w:val="18"/>
+                <w:szCs w:val="18"/>
               </w:rPr>
               <w:t>VR Environment &amp; Exploration</w:t>
             </w:r>
@@ -544,6 +515,8 @@
                 <w:rFonts w:eastAsia="SimSun" w:hint="eastAsia"/>
                 <w:b/>
                 <w:color w:val="191919"/>
+                <w:sz w:val="18"/>
+                <w:szCs w:val="18"/>
                 <w:lang w:eastAsia="zh-CN"/>
               </w:rPr>
               <w:t xml:space="preserve"> Narrative </w:t>
@@ -554,13 +527,27 @@
                 <w:rFonts w:eastAsia="SimSun" w:hint="eastAsia"/>
                 <w:b/>
                 <w:color w:val="191919"/>
+                <w:sz w:val="18"/>
+                <w:szCs w:val="18"/>
                 <w:lang w:eastAsia="zh-CN"/>
               </w:rPr>
-              <w:t>Designer</w:t>
+              <w:t>Desig</w:t>
+            </w:r>
+            <w:r>
+              <w:rPr>
+                <w:rFonts w:eastAsia="SimSun"/>
+                <w:b/>
+                <w:color w:val="191919"/>
+                <w:sz w:val="18"/>
+                <w:szCs w:val="18"/>
+                <w:lang w:eastAsia="zh-CN"/>
+              </w:rPr>
+              <w:t>n</w:t>
             </w:r>
             <w:r>
               <w:rPr>
                 <w:sz w:val="18"/>
+                <w:szCs w:val="18"/>
               </w:rPr>
               <w:t xml:space="preserve">  </w:t>
             </w:r>
@@ -568,6 +555,7 @@
               <w:rPr>
                 <w:rFonts w:eastAsia="SimSun" w:hint="eastAsia"/>
                 <w:sz w:val="18"/>
+                <w:szCs w:val="18"/>
                 <w:lang w:eastAsia="zh-CN"/>
               </w:rPr>
               <w:t>-</w:t>
@@ -577,6 +565,7 @@
               <w:rPr>
                 <w:rFonts w:eastAsia="SimSun" w:hint="eastAsia"/>
                 <w:sz w:val="18"/>
+                <w:szCs w:val="18"/>
                 <w:lang w:eastAsia="zh-CN"/>
               </w:rPr>
               <w:t xml:space="preserve"> Something Lurking </w:t>
@@ -585,6 +574,7 @@
             <w:r>
               <w:rPr>
                 <w:sz w:val="18"/>
+                <w:szCs w:val="18"/>
               </w:rPr>
               <w:t xml:space="preserve">|  </w:t>
             </w:r>
@@ -593,6 +583,7 @@
                 <w:i/>
                 <w:color w:val="191919"/>
                 <w:sz w:val="18"/>
+                <w:szCs w:val="18"/>
               </w:rPr>
               <w:t>Blender</w:t>
             </w:r>
@@ -602,6 +593,7 @@
                 <w:i/>
                 <w:color w:val="191919"/>
                 <w:sz w:val="18"/>
+                <w:szCs w:val="18"/>
               </w:rPr>
               <w:t>, Substance 3D, Unity XR</w:t>
             </w:r>
@@ -609,7 +601,7 @@
           <w:p>
             <w:pPr>
               <w:keepNext/>
-              <w:spacing w:after="20"/>
+              <w:spacing w:line="300" w:lineRule="exact"/>
               <w:rPr>
                 <w:rFonts w:eastAsia="SimSun"/>
                 <w:b/>
@@ -736,7 +728,7 @@
           <w:ilvl w:val="0"/>
           <w:numId w:val="11"/>
         </w:numPr>
-        <w:spacing w:after="80"/>
+        <w:spacing w:after="80" w:line="240" w:lineRule="auto"/>
       </w:pPr>
       <w:r>
         <w:rPr>
@@ -759,7 +751,7 @@
           <w:ilvl w:val="0"/>
           <w:numId w:val="11"/>
         </w:numPr>
-        <w:spacing w:after="80"/>
+        <w:spacing w:after="80" w:line="240" w:lineRule="auto"/>
       </w:pPr>
       <w:r>
         <w:rPr>
@@ -782,7 +774,7 @@
           <w:ilvl w:val="0"/>
           <w:numId w:val="11"/>
         </w:numPr>
-        <w:spacing w:after="80"/>
+        <w:spacing w:line="240" w:lineRule="auto"/>
       </w:pPr>
       <w:r>
         <w:rPr>
@@ -835,82 +827,41 @@
           <w:p>
             <w:pPr>
               <w:keepNext/>
-              <w:spacing w:after="20"/>
+              <w:spacing w:line="300" w:lineRule="exact"/>
               <w:rPr>
                 <w:rFonts w:eastAsia="SimSun"/>
                 <w:b/>
                 <w:i/>
-                <w:sz w:val="19"/>
+                <w:sz w:val="18"/>
+                <w:szCs w:val="18"/>
                 <w:lang w:eastAsia="zh-CN"/>
               </w:rPr>
             </w:pPr>
             <w:r>
               <w:rPr>
-                <w:rFonts w:eastAsia="SimSun" w:hint="eastAsia"/>
+                <w:rFonts w:eastAsia="SimSun"/>
                 <w:b/>
                 <w:color w:val="191919"/>
+                <w:sz w:val="18"/>
+                <w:szCs w:val="18"/>
                 <w:lang w:eastAsia="zh-CN"/>
               </w:rPr>
-              <w:t>Main 2D Artist Director</w:t>
-            </w:r>
-            <w:r>
-              <w:rPr>
-                <w:b/>
-                <w:color w:val="191919"/>
-              </w:rPr>
-              <w:t xml:space="preserve"> &amp; </w:t>
-            </w:r>
-            <w:r>
-              <w:rPr>
-                <w:rFonts w:eastAsia="SimSun" w:hint="eastAsia"/>
-                <w:b/>
-                <w:color w:val="191919"/>
-                <w:lang w:eastAsia="zh-CN"/>
-              </w:rPr>
-              <w:t>Low Fidelity</w:t>
-            </w:r>
-            <w:r>
-              <w:rPr>
-                <w:b/>
-                <w:color w:val="191919"/>
-              </w:rPr>
-              <w:t xml:space="preserve"> Level </w:t>
-            </w:r>
-            <w:proofErr w:type="gramStart"/>
-            <w:r>
-              <w:rPr>
-                <w:b/>
-                <w:color w:val="191919"/>
-              </w:rPr>
-              <w:t>Design</w:t>
-            </w:r>
-            <w:r>
-              <w:rPr>
-                <w:sz w:val="18"/>
-              </w:rPr>
-              <w:t xml:space="preserve">  </w:t>
+              <w:t>Ink Based Self-Drawn Platformer Game</w:t>
             </w:r>
             <w:r>
               <w:rPr>
                 <w:rFonts w:eastAsia="SimSun" w:hint="eastAsia"/>
                 <w:sz w:val="18"/>
+                <w:szCs w:val="18"/>
                 <w:lang w:eastAsia="zh-CN"/>
               </w:rPr>
-              <w:t>-</w:t>
-            </w:r>
-            <w:proofErr w:type="gramEnd"/>
-            <w:r>
-              <w:rPr>
-                <w:rFonts w:eastAsia="SimSun" w:hint="eastAsia"/>
-                <w:sz w:val="18"/>
-                <w:lang w:eastAsia="zh-CN"/>
-              </w:rPr>
-              <w:t xml:space="preserve"> The Last of Stars </w:t>
+              <w:t xml:space="preserve">- The Last of Stars </w:t>
             </w:r>
             <w:proofErr w:type="gramStart"/>
             <w:r>
               <w:rPr>
                 <w:sz w:val="18"/>
+                <w:szCs w:val="18"/>
               </w:rPr>
               <w:t xml:space="preserve">|  </w:t>
             </w:r>
@@ -919,6 +870,7 @@
                 <w:i/>
                 <w:color w:val="191919"/>
                 <w:sz w:val="18"/>
+                <w:szCs w:val="18"/>
               </w:rPr>
               <w:t>Game</w:t>
             </w:r>
@@ -928,6 +880,7 @@
                 <w:i/>
                 <w:color w:val="191919"/>
                 <w:sz w:val="18"/>
+                <w:szCs w:val="18"/>
               </w:rPr>
               <w:t xml:space="preserve"> Art, Figma</w:t>
             </w:r>
@@ -935,7 +888,7 @@
           <w:p>
             <w:pPr>
               <w:keepNext/>
-              <w:spacing w:after="20"/>
+              <w:spacing w:line="300" w:lineRule="exact"/>
               <w:rPr>
                 <w:rFonts w:eastAsia="SimSun"/>
                 <w:b/>
@@ -1004,7 +957,7 @@
           <w:ilvl w:val="0"/>
           <w:numId w:val="11"/>
         </w:numPr>
-        <w:spacing w:after="80"/>
+        <w:spacing w:after="80" w:line="240" w:lineRule="auto"/>
         <w:rPr>
           <w:rFonts w:eastAsia="SimSun"/>
           <w:sz w:val="19"/>
@@ -1074,7 +1027,7 @@
           <w:ilvl w:val="0"/>
           <w:numId w:val="11"/>
         </w:numPr>
-        <w:spacing w:after="80"/>
+        <w:spacing w:after="80" w:line="240" w:lineRule="auto"/>
         <w:rPr>
           <w:rFonts w:eastAsia="SimSun"/>
           <w:sz w:val="19"/>
@@ -1107,7 +1060,7 @@
           <w:ilvl w:val="0"/>
           <w:numId w:val="11"/>
         </w:numPr>
-        <w:spacing w:after="80"/>
+        <w:spacing w:line="240" w:lineRule="auto"/>
         <w:rPr>
           <w:rFonts w:eastAsia="SimSun"/>
           <w:sz w:val="19"/>
@@ -1165,11 +1118,12 @@
           <w:p>
             <w:pPr>
               <w:keepNext/>
-              <w:spacing w:after="20"/>
+              <w:spacing w:line="300" w:lineRule="exact"/>
               <w:rPr>
                 <w:rFonts w:eastAsia="SimSun"/>
                 <w:i/>
-                <w:sz w:val="19"/>
+                <w:sz w:val="18"/>
+                <w:szCs w:val="18"/>
                 <w:lang w:eastAsia="zh-CN"/>
               </w:rPr>
             </w:pPr>
@@ -1177,6 +1131,8 @@
               <w:rPr>
                 <w:b/>
                 <w:color w:val="191919"/>
+                <w:sz w:val="18"/>
+                <w:szCs w:val="18"/>
               </w:rPr>
               <w:t xml:space="preserve">Wordless 3D Animated </w:t>
             </w:r>
@@ -1185,12 +1141,15 @@
               <w:rPr>
                 <w:b/>
                 <w:color w:val="191919"/>
+                <w:sz w:val="18"/>
+                <w:szCs w:val="18"/>
               </w:rPr>
               <w:t>Short</w:t>
             </w:r>
             <w:r>
               <w:rPr>
                 <w:sz w:val="18"/>
+                <w:szCs w:val="18"/>
               </w:rPr>
               <w:t xml:space="preserve">  </w:t>
             </w:r>
@@ -1198,6 +1157,7 @@
               <w:rPr>
                 <w:rFonts w:eastAsia="SimSun" w:hint="eastAsia"/>
                 <w:sz w:val="18"/>
+                <w:szCs w:val="18"/>
                 <w:lang w:eastAsia="zh-CN"/>
               </w:rPr>
               <w:t>-</w:t>
@@ -1207,6 +1167,7 @@
               <w:rPr>
                 <w:rFonts w:eastAsia="SimSun" w:hint="eastAsia"/>
                 <w:sz w:val="18"/>
+                <w:szCs w:val="18"/>
                 <w:lang w:eastAsia="zh-CN"/>
               </w:rPr>
               <w:t xml:space="preserve"> BLU </w:t>
@@ -1215,6 +1176,7 @@
             <w:r>
               <w:rPr>
                 <w:sz w:val="18"/>
+                <w:szCs w:val="18"/>
               </w:rPr>
               <w:t xml:space="preserve">|  </w:t>
             </w:r>
@@ -1223,6 +1185,7 @@
                 <w:i/>
                 <w:color w:val="191919"/>
                 <w:sz w:val="18"/>
+                <w:szCs w:val="18"/>
               </w:rPr>
               <w:t>Maya</w:t>
             </w:r>
@@ -1232,6 +1195,7 @@
                 <w:i/>
                 <w:color w:val="191919"/>
                 <w:sz w:val="18"/>
+                <w:szCs w:val="18"/>
               </w:rPr>
               <w:t>, Blender, Concept Art, Animation</w:t>
             </w:r>
@@ -1239,7 +1203,7 @@
           <w:p>
             <w:pPr>
               <w:keepNext/>
-              <w:spacing w:after="20"/>
+              <w:spacing w:line="300" w:lineRule="exact"/>
               <w:rPr>
                 <w:rFonts w:eastAsia="SimSun"/>
                 <w:b/>
@@ -1316,7 +1280,7 @@
           <w:ilvl w:val="0"/>
           <w:numId w:val="11"/>
         </w:numPr>
-        <w:spacing w:after="80"/>
+        <w:spacing w:after="80" w:line="240" w:lineRule="auto"/>
       </w:pPr>
       <w:r>
         <w:rPr>
@@ -1339,7 +1303,7 @@
           <w:ilvl w:val="0"/>
           <w:numId w:val="11"/>
         </w:numPr>
-        <w:spacing w:after="80"/>
+        <w:spacing w:after="80" w:line="240" w:lineRule="auto"/>
         <w:rPr>
           <w:rFonts w:eastAsia="SimSun"/>
           <w:sz w:val="19"/>
@@ -1395,6 +1359,16 @@
         </w:rPr>
         <w:t xml:space="preserve"> &amp; VOLUNTEER</w:t>
       </w:r>
+      <w:r>
+        <w:rPr>
+          <w:rFonts w:eastAsia="SimSun"/>
+          <w:b/>
+          <w:color w:val="C12525"/>
+          <w:sz w:val="26"/>
+          <w:lang w:eastAsia="zh-CN"/>
+        </w:rPr>
+        <w:t xml:space="preserve"> WORK EXPERIENCE</w:t>
+      </w:r>
     </w:p>
     <w:p>
       <w:pPr>
@@ -1438,11 +1412,12 @@
       </w:tblPr>
       <w:tblGrid>
         <w:gridCol w:w="5424"/>
-        <w:gridCol w:w="5424"/>
+        <w:gridCol w:w="5190"/>
+        <w:gridCol w:w="236"/>
       </w:tblGrid>
       <w:tr>
         <w:trPr>
-          <w:trHeight w:val="531"/>
+          <w:trHeight w:val="315"/>
         </w:trPr>
         <w:tc>
           <w:tcPr>
@@ -1456,7 +1431,7 @@
           </w:tcPr>
           <w:p>
             <w:pPr>
-              <w:spacing w:after="40"/>
+              <w:spacing w:line="240" w:lineRule="atLeast"/>
               <w:rPr>
                 <w:rFonts w:eastAsia="SimSun"/>
                 <w:sz w:val="18"/>
@@ -1477,6 +1452,7 @@
         <w:tc>
           <w:tcPr>
             <w:tcW w:w="5424" w:type="dxa"/>
+            <w:gridSpan w:val="2"/>
             <w:tcBorders>
               <w:top w:val="nil"/>
               <w:left w:val="nil"/>
@@ -1486,7 +1462,7 @@
           </w:tcPr>
           <w:p>
             <w:pPr>
-              <w:spacing w:after="40"/>
+              <w:spacing w:line="240" w:lineRule="atLeast"/>
               <w:ind w:firstLine="720"/>
               <w:jc w:val="right"/>
               <w:rPr>
@@ -1522,102 +1498,14 @@
           </w:p>
         </w:tc>
       </w:tr>
-    </w:tbl>
-    <w:p>
-      <w:pPr>
-        <w:spacing w:after="40"/>
-        <w:rPr>
-          <w:rFonts w:eastAsia="SimSun"/>
-          <w:sz w:val="18"/>
-          <w:lang w:eastAsia="zh-CN"/>
-        </w:rPr>
-      </w:pPr>
-      <w:r>
-        <w:rPr>
-          <w:rFonts w:eastAsia="SimSun" w:hint="eastAsia"/>
-          <w:b/>
-          <w:bCs/>
-          <w:sz w:val="18"/>
-          <w:lang w:eastAsia="zh-CN"/>
-        </w:rPr>
-        <w:t>SFU Game</w:t>
-      </w:r>
-      <w:r>
-        <w:rPr>
-          <w:rFonts w:eastAsia="SimSun" w:hint="eastAsia"/>
-          <w:b/>
-          <w:bCs/>
-          <w:sz w:val="18"/>
-          <w:lang w:eastAsia="zh-CN"/>
-        </w:rPr>
-        <w:t xml:space="preserve"> D</w:t>
-      </w:r>
-      <w:r>
-        <w:rPr>
-          <w:rFonts w:eastAsia="SimSun" w:hint="eastAsia"/>
-          <w:b/>
-          <w:bCs/>
-          <w:sz w:val="18"/>
-          <w:lang w:eastAsia="zh-CN"/>
-        </w:rPr>
-        <w:t>ev</w:t>
-      </w:r>
-      <w:r>
-        <w:rPr>
-          <w:rFonts w:eastAsia="SimSun" w:hint="eastAsia"/>
-          <w:b/>
-          <w:bCs/>
-          <w:sz w:val="18"/>
-          <w:lang w:eastAsia="zh-CN"/>
-        </w:rPr>
-        <w:t>elopment</w:t>
-      </w:r>
-      <w:r>
-        <w:rPr>
-          <w:rFonts w:eastAsia="SimSun" w:hint="eastAsia"/>
-          <w:b/>
-          <w:bCs/>
-          <w:sz w:val="18"/>
-          <w:lang w:eastAsia="zh-CN"/>
-        </w:rPr>
-        <w:t xml:space="preserve"> Club</w:t>
-      </w:r>
-      <w:r>
-        <w:rPr>
-          <w:rFonts w:eastAsia="SimSun" w:hint="eastAsia"/>
-          <w:b/>
-          <w:bCs/>
-          <w:sz w:val="18"/>
-          <w:lang w:eastAsia="zh-CN"/>
-        </w:rPr>
-        <w:t xml:space="preserve"> </w:t>
-      </w:r>
-      <w:r>
-        <w:rPr>
-          <w:rFonts w:eastAsia="SimSun" w:hint="eastAsia"/>
-          <w:sz w:val="18"/>
-          <w:lang w:eastAsia="zh-CN"/>
-        </w:rPr>
-        <w:t>|</w:t>
-      </w:r>
-    </w:p>
-    <w:tbl>
-      <w:tblPr>
-        <w:tblStyle w:val="aff1"/>
-        <w:tblW w:w="0" w:type="auto"/>
-        <w:tblLook w:val="04A0" w:firstRow="1" w:lastRow="0" w:firstColumn="1" w:lastColumn="0" w:noHBand="0" w:noVBand="1"/>
-      </w:tblPr>
-      <w:tblGrid>
-        <w:gridCol w:w="5424"/>
-        <w:gridCol w:w="5424"/>
-      </w:tblGrid>
       <w:tr>
         <w:trPr>
-          <w:trHeight w:val="390"/>
+          <w:trHeight w:val="531"/>
         </w:trPr>
         <w:tc>
           <w:tcPr>
-            <w:tcW w:w="5424" w:type="dxa"/>
+            <w:tcW w:w="10614" w:type="dxa"/>
+            <w:gridSpan w:val="2"/>
             <w:tcBorders>
               <w:top w:val="nil"/>
               <w:left w:val="nil"/>
@@ -1627,38 +1515,119 @@
           </w:tcPr>
           <w:p>
             <w:pPr>
-              <w:spacing w:after="40"/>
+              <w:pStyle w:val="ae"/>
+              <w:numPr>
+                <w:ilvl w:val="0"/>
+                <w:numId w:val="11"/>
+              </w:numPr>
+              <w:spacing w:line="240" w:lineRule="atLeast"/>
               <w:rPr>
-                <w:rFonts w:eastAsia="SimSun" w:hint="eastAsia"/>
-                <w:sz w:val="18"/>
+                <w:rFonts w:eastAsia="SimSun"/>
+                <w:sz w:val="19"/>
                 <w:lang w:eastAsia="zh-CN"/>
               </w:rPr>
             </w:pPr>
             <w:r>
               <w:rPr>
                 <w:b/>
-                <w:bCs/>
-                <w:sz w:val="32"/>
-                <w:szCs w:val="32"/>
+                <w:sz w:val="19"/>
               </w:rPr>
-              <w:t>E</w:t>
+              <w:t xml:space="preserve">Recreated fallout 3 </w:t>
             </w:r>
             <w:r>
               <w:rPr>
-                <w:rFonts w:eastAsia="SimSun" w:hint="eastAsia"/>
+                <w:bCs/>
+                <w:sz w:val="19"/>
+              </w:rPr>
+              <w:t>game assets</w:t>
+            </w:r>
+            <w:r>
+              <w:rPr>
                 <w:b/>
+                <w:sz w:val="19"/>
+              </w:rPr>
+              <w:t xml:space="preserve"> </w:t>
+            </w:r>
+            <w:r>
+              <w:rPr>
                 <w:bCs/>
-                <w:sz w:val="32"/>
-                <w:szCs w:val="32"/>
+                <w:sz w:val="19"/>
+              </w:rPr>
+              <w:t xml:space="preserve">with modern </w:t>
+            </w:r>
+            <w:r>
+              <w:rPr>
+                <w:b/>
+                <w:sz w:val="19"/>
+              </w:rPr>
+              <w:t>Bethesda</w:t>
+            </w:r>
+            <w:r>
+              <w:rPr>
+                <w:bCs/>
+                <w:sz w:val="19"/>
+              </w:rPr>
+              <w:t xml:space="preserve"> workflow, </w:t>
+            </w:r>
+            <w:proofErr w:type="gramStart"/>
+            <w:r>
+              <w:rPr>
+                <w:bCs/>
+                <w:sz w:val="19"/>
+              </w:rPr>
+              <w:t>using .</w:t>
+            </w:r>
+            <w:proofErr w:type="spellStart"/>
+            <w:r>
+              <w:rPr>
+                <w:bCs/>
+                <w:sz w:val="19"/>
+              </w:rPr>
+              <w:t>nif</w:t>
+            </w:r>
+            <w:proofErr w:type="spellEnd"/>
+            <w:proofErr w:type="gramEnd"/>
+            <w:r>
+              <w:rPr>
+                <w:bCs/>
+                <w:sz w:val="19"/>
+              </w:rPr>
+              <w:t xml:space="preserve"> format and 3 different type of maps rendered straight from Substance 3D Painter.</w:t>
+            </w:r>
+          </w:p>
+          <w:p>
+            <w:pPr>
+              <w:pStyle w:val="ae"/>
+              <w:numPr>
+                <w:ilvl w:val="0"/>
+                <w:numId w:val="11"/>
+              </w:numPr>
+              <w:spacing w:line="240" w:lineRule="atLeast"/>
+              <w:rPr>
+                <w:rFonts w:eastAsia="SimSun"/>
+                <w:sz w:val="19"/>
                 <w:lang w:eastAsia="zh-CN"/>
               </w:rPr>
-              <w:t>xecutive</w:t>
+            </w:pPr>
+            <w:r>
+              <w:rPr>
+                <w:b/>
+                <w:sz w:val="19"/>
+              </w:rPr>
+              <w:t>Modeled</w:t>
+            </w:r>
+            <w:r>
+              <w:rPr>
+                <w:bCs/>
+                <w:sz w:val="19"/>
+              </w:rPr>
+              <w:t xml:space="preserve"> over 5+ prop assets for the modding team to place them in the Fallout 4 game environment.</w:t>
             </w:r>
           </w:p>
         </w:tc>
         <w:tc>
           <w:tcPr>
-            <w:tcW w:w="5424" w:type="dxa"/>
+            <w:tcW w:w="236" w:type="dxa"/>
             <w:tcBorders>
               <w:top w:val="nil"/>
               <w:left w:val="nil"/>
@@ -1668,47 +1637,15 @@
           </w:tcPr>
           <w:p>
             <w:pPr>
-              <w:spacing w:after="40"/>
+              <w:spacing w:line="240" w:lineRule="atLeast"/>
               <w:ind w:firstLine="720"/>
               <w:jc w:val="right"/>
-              <w:rPr>
-                <w:rFonts w:eastAsia="SimSun"/>
-                <w:szCs w:val="20"/>
-                <w:lang w:eastAsia="zh-CN"/>
-              </w:rPr>
-            </w:pPr>
-            <w:r>
               <w:rPr>
                 <w:rFonts w:eastAsia="SimSun" w:hint="eastAsia"/>
                 <w:szCs w:val="20"/>
                 <w:lang w:eastAsia="zh-CN"/>
               </w:rPr>
-              <w:t>Sep</w:t>
-            </w:r>
-            <w:r>
-              <w:rPr>
-                <w:rFonts w:eastAsia="SimSun" w:hint="eastAsia"/>
-                <w:szCs w:val="20"/>
-                <w:lang w:eastAsia="zh-CN"/>
-              </w:rPr>
-              <w:t xml:space="preserve"> 2026 </w:t>
-            </w:r>
-            <w:r>
-              <w:rPr>
-                <w:rFonts w:eastAsia="SimSun"/>
-                <w:szCs w:val="20"/>
-                <w:lang w:eastAsia="zh-CN"/>
-              </w:rPr>
-              <w:t>–</w:t>
-            </w:r>
-            <w:r>
-              <w:rPr>
-                <w:rFonts w:eastAsia="SimSun" w:hint="eastAsia"/>
-                <w:szCs w:val="20"/>
-                <w:lang w:eastAsia="zh-CN"/>
-              </w:rPr>
-              <w:t xml:space="preserve"> Present</w:t>
-            </w:r>
+            </w:pPr>
           </w:p>
         </w:tc>
       </w:tr>
@@ -1756,7 +1693,7 @@
       </w:tblGrid>
       <w:tr>
         <w:trPr>
-          <w:trHeight w:val="414"/>
+          <w:trHeight w:val="321"/>
         </w:trPr>
         <w:tc>
           <w:tcPr>
@@ -1770,9 +1707,9 @@
           </w:tcPr>
           <w:p>
             <w:pPr>
-              <w:spacing w:after="40"/>
+              <w:spacing w:line="240" w:lineRule="atLeast"/>
               <w:rPr>
-                <w:rFonts w:eastAsia="SimSun" w:hint="eastAsia"/>
+                <w:rFonts w:eastAsia="SimSun"/>
                 <w:sz w:val="18"/>
                 <w:lang w:eastAsia="zh-CN"/>
               </w:rPr>
@@ -1802,7 +1739,7 @@
           </w:tcPr>
           <w:p>
             <w:pPr>
-              <w:spacing w:after="40"/>
+              <w:spacing w:line="240" w:lineRule="atLeast"/>
               <w:ind w:firstLine="720"/>
               <w:jc w:val="right"/>
               <w:rPr>
@@ -1849,12 +1786,225 @@
     </w:tbl>
     <w:p>
       <w:pPr>
-        <w:spacing w:after="40"/>
+        <w:pStyle w:val="ae"/>
+        <w:numPr>
+          <w:ilvl w:val="0"/>
+          <w:numId w:val="11"/>
+        </w:numPr>
+        <w:spacing w:after="240" w:line="240" w:lineRule="atLeast"/>
         <w:rPr>
           <w:rFonts w:eastAsia="SimSun"/>
           <w:lang w:eastAsia="zh-CN"/>
         </w:rPr>
       </w:pPr>
+      <w:r>
+        <w:rPr>
+          <w:b/>
+          <w:sz w:val="19"/>
+        </w:rPr>
+        <w:t xml:space="preserve">Held Meetings </w:t>
+      </w:r>
+      <w:r>
+        <w:rPr>
+          <w:bCs/>
+          <w:sz w:val="19"/>
+        </w:rPr>
+        <w:t>for start-up clubs in SFU Surrey campus.</w:t>
+      </w:r>
+    </w:p>
+    <w:p>
+      <w:pPr>
+        <w:spacing w:after="40"/>
+        <w:rPr>
+          <w:rFonts w:eastAsia="SimSun"/>
+          <w:sz w:val="18"/>
+          <w:lang w:eastAsia="zh-CN"/>
+        </w:rPr>
+      </w:pPr>
+      <w:r>
+        <w:rPr>
+          <w:b/>
+          <w:sz w:val="18"/>
+        </w:rPr>
+        <w:t xml:space="preserve">SFU </w:t>
+      </w:r>
+      <w:r>
+        <w:rPr>
+          <w:b/>
+          <w:sz w:val="18"/>
+        </w:rPr>
+        <w:t>Game Development</w:t>
+      </w:r>
+      <w:r>
+        <w:rPr>
+          <w:b/>
+          <w:sz w:val="18"/>
+        </w:rPr>
+        <w:t xml:space="preserve"> Club</w:t>
+      </w:r>
+      <w:r>
+        <w:rPr>
+          <w:rFonts w:eastAsia="SimSun" w:hint="eastAsia"/>
+          <w:sz w:val="18"/>
+          <w:lang w:eastAsia="zh-CN"/>
+        </w:rPr>
+        <w:t>|</w:t>
+      </w:r>
+      <w:r>
+        <w:rPr>
+          <w:sz w:val="18"/>
+        </w:rPr>
+        <w:t xml:space="preserve"> </w:t>
+      </w:r>
+    </w:p>
+    <w:tbl>
+      <w:tblPr>
+        <w:tblStyle w:val="aff1"/>
+        <w:tblW w:w="0" w:type="auto"/>
+        <w:tblLook w:val="04A0" w:firstRow="1" w:lastRow="0" w:firstColumn="1" w:lastColumn="0" w:noHBand="0" w:noVBand="1"/>
+      </w:tblPr>
+      <w:tblGrid>
+        <w:gridCol w:w="5424"/>
+        <w:gridCol w:w="5424"/>
+      </w:tblGrid>
+      <w:tr>
+        <w:trPr>
+          <w:trHeight w:val="414"/>
+        </w:trPr>
+        <w:tc>
+          <w:tcPr>
+            <w:tcW w:w="5424" w:type="dxa"/>
+            <w:tcBorders>
+              <w:top w:val="nil"/>
+              <w:left w:val="nil"/>
+              <w:bottom w:val="nil"/>
+              <w:right w:val="nil"/>
+            </w:tcBorders>
+          </w:tcPr>
+          <w:p>
+            <w:pPr>
+              <w:spacing w:after="40"/>
+              <w:rPr>
+                <w:rFonts w:eastAsia="SimSun"/>
+                <w:sz w:val="18"/>
+                <w:lang w:eastAsia="zh-CN"/>
+              </w:rPr>
+            </w:pPr>
+            <w:r>
+              <w:rPr>
+                <w:rFonts w:eastAsia="SimSun"/>
+                <w:b/>
+                <w:bCs/>
+                <w:sz w:val="32"/>
+                <w:szCs w:val="32"/>
+                <w:lang w:eastAsia="zh-CN"/>
+              </w:rPr>
+              <w:t>Graphic Design</w:t>
+            </w:r>
+            <w:r>
+              <w:rPr>
+                <w:rFonts w:eastAsia="SimSun" w:hint="eastAsia"/>
+                <w:b/>
+                <w:bCs/>
+                <w:sz w:val="32"/>
+                <w:szCs w:val="32"/>
+                <w:lang w:eastAsia="zh-CN"/>
+              </w:rPr>
+              <w:t xml:space="preserve"> Executive</w:t>
+            </w:r>
+          </w:p>
+        </w:tc>
+        <w:tc>
+          <w:tcPr>
+            <w:tcW w:w="5424" w:type="dxa"/>
+            <w:tcBorders>
+              <w:top w:val="nil"/>
+              <w:left w:val="nil"/>
+              <w:bottom w:val="nil"/>
+              <w:right w:val="nil"/>
+            </w:tcBorders>
+          </w:tcPr>
+          <w:p>
+            <w:pPr>
+              <w:spacing w:after="40"/>
+              <w:ind w:firstLine="720"/>
+              <w:jc w:val="right"/>
+              <w:rPr>
+                <w:rFonts w:eastAsia="SimSun"/>
+                <w:szCs w:val="20"/>
+                <w:lang w:eastAsia="zh-CN"/>
+              </w:rPr>
+            </w:pPr>
+            <w:r>
+              <w:rPr>
+                <w:rFonts w:eastAsia="SimSun" w:hint="eastAsia"/>
+                <w:szCs w:val="20"/>
+                <w:lang w:eastAsia="zh-CN"/>
+              </w:rPr>
+              <w:t xml:space="preserve">Sep 2026 </w:t>
+            </w:r>
+            <w:r>
+              <w:rPr>
+                <w:rFonts w:eastAsia="SimSun"/>
+                <w:szCs w:val="20"/>
+                <w:lang w:eastAsia="zh-CN"/>
+              </w:rPr>
+              <w:t>–</w:t>
+            </w:r>
+            <w:r>
+              <w:rPr>
+                <w:rFonts w:eastAsia="SimSun" w:hint="eastAsia"/>
+                <w:szCs w:val="20"/>
+                <w:lang w:eastAsia="zh-CN"/>
+              </w:rPr>
+              <w:t xml:space="preserve"> Present</w:t>
+            </w:r>
+          </w:p>
+        </w:tc>
+      </w:tr>
+    </w:tbl>
+    <w:p>
+      <w:pPr>
+        <w:pStyle w:val="ae"/>
+        <w:numPr>
+          <w:ilvl w:val="0"/>
+          <w:numId w:val="11"/>
+        </w:numPr>
+        <w:spacing w:after="240" w:line="240" w:lineRule="atLeast"/>
+        <w:jc w:val="both"/>
+        <w:rPr>
+          <w:rFonts w:eastAsia="SimSun"/>
+          <w:lang w:eastAsia="zh-CN"/>
+        </w:rPr>
+      </w:pPr>
+      <w:r>
+        <w:rPr>
+          <w:b/>
+          <w:sz w:val="19"/>
+        </w:rPr>
+        <w:t>Designed</w:t>
+      </w:r>
+      <w:r>
+        <w:rPr>
+          <w:bCs/>
+          <w:sz w:val="19"/>
+        </w:rPr>
+        <w:t xml:space="preserve"> </w:t>
+      </w:r>
+      <w:r>
+        <w:rPr>
+          <w:bCs/>
+          <w:sz w:val="19"/>
+        </w:rPr>
+        <w:t>posters, insta grid and event banners</w:t>
+      </w:r>
+      <w:r>
+        <w:rPr>
+          <w:bCs/>
+          <w:sz w:val="19"/>
+        </w:rPr>
+        <w:t xml:space="preserve"> with layout, grid, hierarchy and gestalt knowledge.</w:t>
+      </w:r>
     </w:p>
     <w:sectPr>
       <w:pgSz w:w="12240" w:h="15840"/>
@@ -2740,7 +2890,7 @@
   <w:style w:type="paragraph" w:default="1" w:styleId="a1">
     <w:name w:val="Normal"/>
     <w:qFormat/>
-    <w:rsid w:val="00A76DA3"/>
+    <w:rsid w:val="0036568D"/>
     <w:pPr>
       <w:spacing w:after="0" w:line="264" w:lineRule="auto"/>
     </w:pPr>
@@ -2960,7 +3110,6 @@
   <w:style w:type="character" w:default="1" w:styleId="a2">
     <w:name w:val="Default Paragraph Font"/>
     <w:uiPriority w:val="1"/>
-    <w:semiHidden/>
     <w:unhideWhenUsed/>
   </w:style>
   <w:style w:type="table" w:default="1" w:styleId="a3">

</xml_diff>